<commit_message>
Fix BA 336 meeting time and rename course schedule file
</commit_message>
<xml_diff>
--- a/data/BA 336/Course Admin/syllabus.docx
+++ b/data/BA 336/Course Admin/syllabus.docx
@@ -405,7 +405,7 @@
                 <w:szCs w:val="20"/>
                 <w:rtl w:val="0"/>
               </w:rPr>
-              <w:t xml:space="preserve">Wednesdays from 9:00am - 10:50pm, KMC 560</w:t>
+              <w:t xml:space="preserve">Wednesdays from 9:00am - 10:50am, KMC 560</w:t>
             </w:r>
             <w:r>
               <w:rPr>
@@ -1528,12 +1528,12 @@
             <wp:extent cx="1028930" cy="1343025"/>
             <wp:effectExtent b="0" l="0" r="0" t="0"/>
             <wp:wrapSquare wrapText="bothSides" distB="114300" distT="114300" distL="114300" distR="114300"/>
-            <wp:docPr descr="A green and white sign  Description automatically generated with low confidence" id="4" name="image2.jpg"/>
+            <wp:docPr descr="A green and white sign  Description automatically generated with low confidence" id="4" name="image1.jpg"/>
             <a:graphic>
               <a:graphicData uri="http://schemas.openxmlformats.org/drawingml/2006/picture">
                 <pic:pic>
                   <pic:nvPicPr>
-                    <pic:cNvPr descr="A green and white sign  Description automatically generated with low confidence" id="0" name="image2.jpg"/>
+                    <pic:cNvPr descr="A green and white sign  Description automatically generated with low confidence" id="0" name="image1.jpg"/>
                     <pic:cNvPicPr preferRelativeResize="0"/>
                   </pic:nvPicPr>
                   <pic:blipFill>
@@ -11705,12 +11705,12 @@
         <wp:inline distB="114300" distT="114300" distL="114300" distR="114300">
           <wp:extent cx="2109788" cy="420720"/>
           <wp:effectExtent b="0" l="0" r="0" t="0"/>
-          <wp:docPr id="3" name="image1.png"/>
+          <wp:docPr id="3" name="image2.png"/>
           <a:graphic>
             <a:graphicData uri="http://schemas.openxmlformats.org/drawingml/2006/picture">
               <pic:pic>
                 <pic:nvPicPr>
-                  <pic:cNvPr id="0" name="image1.png"/>
+                  <pic:cNvPr id="0" name="image2.png"/>
                   <pic:cNvPicPr preferRelativeResize="0"/>
                 </pic:nvPicPr>
                 <pic:blipFill>

</xml_diff>

<commit_message>
Clarify BA 336 late policy and remove stale final exam date
Five-day standard window with instructor-only exceptions, approved late work due Monday of Week 11, final exam chapters consistent across syllabus and schedule.
</commit_message>
<xml_diff>
--- a/data/BA 336/Course Admin/syllabus.docx
+++ b/data/BA 336/Course Admin/syllabus.docx
@@ -1528,12 +1528,12 @@
             <wp:extent cx="1028930" cy="1343025"/>
             <wp:effectExtent b="0" l="0" r="0" t="0"/>
             <wp:wrapSquare wrapText="bothSides" distB="114300" distT="114300" distL="114300" distR="114300"/>
-            <wp:docPr descr="A green and white sign  Description automatically generated with low confidence" id="4" name="image1.jpg"/>
+            <wp:docPr descr="A green and white sign  Description automatically generated with low confidence" id="4" name="image2.jpg"/>
             <a:graphic>
               <a:graphicData uri="http://schemas.openxmlformats.org/drawingml/2006/picture">
                 <pic:pic>
                   <pic:nvPicPr>
-                    <pic:cNvPr descr="A green and white sign  Description automatically generated with low confidence" id="0" name="image1.jpg"/>
+                    <pic:cNvPr descr="A green and white sign  Description automatically generated with low confidence" id="0" name="image2.jpg"/>
                     <pic:cNvPicPr preferRelativeResize="0"/>
                   </pic:nvPicPr>
                   <pic:blipFill>
@@ -10832,8 +10832,7 @@
       <w:pPr>
         <w:ind w:right="112"/>
         <w:rPr>
-          <w:rFonts w:ascii="Calibri" w:cs="Calibri" w:eastAsia="Calibri" w:hAnsi="Calibri"/>
-          <w:color w:val="2e75b5"/>
+          <w:rFonts w:ascii="Times New Roman" w:cs="Times New Roman" w:eastAsia="Times New Roman" w:hAnsi="Times New Roman"/>
           <w:sz w:val="20"/>
           <w:szCs w:val="20"/>
         </w:rPr>
@@ -10845,16 +10844,45 @@
           <w:szCs w:val="20"/>
           <w:rtl w:val="0"/>
         </w:rPr>
-        <w:t xml:space="preserve">Due dates are important in this class as we move quickly through the material. Also, the professional skill of meeting deadlines is valuable. Due dates are firm but exceptions include a Five-Day Late “Window:” Assignments may be submitted up to five days late with a 12% point deduction. That means the highest grade you can get is a B+. After that, submissions are closed. Late Work Note: For emergencies beyond the two-week window, contact your instructor ASAP. Extensions may be granted on a case-by-case basis. </w:t>
-      </w:r>
-      <w:r>
+        <w:t xml:space="preserve">Due dates are firm. The course moves quickly, and meeting deadlines is a professional skill.</w:t>
+      </w:r>
+    </w:p>
+    <w:p>
+      <w:pPr>
+        <w:ind w:right="112"/>
         <w:rPr>
           <w:rFonts w:ascii="Times New Roman" w:cs="Times New Roman" w:eastAsia="Times New Roman" w:hAnsi="Times New Roman"/>
           <w:sz w:val="20"/>
           <w:szCs w:val="20"/>
-          <w:rtl w:val="0"/>
-        </w:rPr>
-        <w:t xml:space="preserve">Technical issues on any machine will not be accepted as an excuse for incomplete work. Start assignments with plenty of time to finish and/or time to address technical issues.</w:t>
+        </w:rPr>
+      </w:pPr>
+      <w:r>
+        <w:rPr>
+          <w:rFonts w:ascii="Times New Roman" w:cs="Times New Roman" w:eastAsia="Times New Roman" w:hAnsi="Times New Roman"/>
+          <w:sz w:val="20"/>
+          <w:szCs w:val="20"/>
+          <w:rtl w:val="0"/>
+        </w:rPr>
+        <w:t xml:space="preserve">Standard late window: Any assignment may be submitted up to five days after its due date with a 12% point deduction, so the highest possible grade is a B+. After five days, submissions are closed.</w:t>
+      </w:r>
+    </w:p>
+    <w:p>
+      <w:pPr>
+        <w:ind w:right="112"/>
+        <w:rPr>
+          <w:rFonts w:ascii="Times New Roman" w:cs="Times New Roman" w:eastAsia="Times New Roman" w:hAnsi="Times New Roman"/>
+          <w:sz w:val="20"/>
+          <w:szCs w:val="20"/>
+        </w:rPr>
+      </w:pPr>
+      <w:r>
+        <w:rPr>
+          <w:rFonts w:ascii="Times New Roman" w:cs="Times New Roman" w:eastAsia="Times New Roman" w:hAnsi="Times New Roman"/>
+          <w:sz w:val="20"/>
+          <w:szCs w:val="20"/>
+          <w:rtl w:val="0"/>
+        </w:rPr>
+        <w:t xml:space="preserve">Exceptions: If an emergency or circumstance beyond your control keeps you from submitting within the five-day window, contact me as soon as you can, ideally before the window closes. I review extension requests case by case, and an extension is never automatic. Only the instructor can approve one. Technical problems with your own device or software are not grounds for an extension, so start assignments with plenty of time. Approved late work must be submitted by 11:59 pm on the Monday of Week 11, before the final exam. This deadline applies even if the standard five-day window would otherwise run longer.</w:t>
       </w:r>
       <w:r>
         <w:rPr>
@@ -11705,12 +11733,12 @@
         <wp:inline distB="114300" distT="114300" distL="114300" distR="114300">
           <wp:extent cx="2109788" cy="420720"/>
           <wp:effectExtent b="0" l="0" r="0" t="0"/>
-          <wp:docPr id="3" name="image2.png"/>
+          <wp:docPr id="3" name="image1.png"/>
           <a:graphic>
             <a:graphicData uri="http://schemas.openxmlformats.org/drawingml/2006/picture">
               <pic:pic>
                 <pic:nvPicPr>
-                  <pic:cNvPr id="0" name="image2.png"/>
+                  <pic:cNvPr id="0" name="image1.png"/>
                   <pic:cNvPicPr preferRelativeResize="0"/>
                 </pic:nvPicPr>
                 <pic:blipFill>

</xml_diff>